<commit_message>
Docs: add Repair/Uninstall existing-installation detection
- TechDoc §8.5.3: GetUninstallString, IsAlreadyInstalled, InitializeSetup
  functions documented with registry key path and three-branch behavior
- BRS §5.10 FR-36: installer must detect existing install and offer
  Repair / Uninstall / Cancel dialog
- UserManual §0.2: user-facing "Upgrading or Repairing" subsection
  explaining all three dialog choices
- Notes: dated dev note covering registry lookup, InitializeSetup hook,
  and three-branch logic

Co-Authored-By: Claude Sonnet 4.6 <noreply@anthropic.com>
</commit_message>
<xml_diff>
--- a/FileExplorerNotes.docx
+++ b/FileExplorerNotes.docx
@@ -254,6 +254,78 @@
       </w:pPr>
       <w:r>
         <w:t xml:space="preserve"/>
+      </w:r>
+    </w:p>
+    <w:p>
+      <w:pPr>
+        <w:spacing w:after="0" w:before="0"/>
+      </w:pPr>
+      <w:r>
+        <w:t xml:space="preserve"/>
+      </w:r>
+    </w:p>
+    <w:p>
+      <w:pPr>
+        <w:spacing w:after="60" w:before="240"/>
+      </w:pPr>
+      <w:r>
+        <w:rPr>
+          <w:b/>
+        </w:rPr>
+        <w:t xml:space="preserve">2026-06-12 — Installer Existing-Installation Detection (FileExplorer.iss)</w:t>
+      </w:r>
+    </w:p>
+    <w:p>
+      <w:pPr>
+        <w:spacing w:after="40" w:before="40"/>
+      </w:pPr>
+      <w:r>
+        <w:t xml:space="preserve">Added a [Code] section to FileExplorer.iss implementing three-branch logic that runs before the Inno Setup wizard appears:</w:t>
+      </w:r>
+    </w:p>
+    <w:p>
+      <w:pPr>
+        <w:spacing w:after="30" w:before="30"/>
+        <w:ind w:left="360"/>
+      </w:pPr>
+      <w:r>
+        <w:rPr>
+          <w:b/>
+        </w:rPr>
+        <w:t xml:space="preserve">Registry key lookup</w:t>
+      </w:r>
+      <w:r>
+        <w:t xml:space="preserve"> — GetUninstallString reads HKLM\Software\Microsoft\Windows\CurrentVersion\Uninstall\{AppId}_is1 for the uninstall string. Falls back to HKCU if the HKLM key is absent. IsAlreadyInstalled returns True when the string is non-empty.</w:t>
+      </w:r>
+    </w:p>
+    <w:p>
+      <w:pPr>
+        <w:spacing w:after="30" w:before="30"/>
+        <w:ind w:left="360"/>
+      </w:pPr>
+      <w:r>
+        <w:rPr>
+          <w:b/>
+        </w:rPr>
+        <w:t xml:space="preserve">InitializeSetup hook</w:t>
+      </w:r>
+      <w:r>
+        <w:t xml:space="preserve"> — Inno Setup calls this before showing any UI. If IsAlreadyInstalled is True, a MsgBox with Yes/No/Cancel buttons is displayed.</w:t>
+      </w:r>
+    </w:p>
+    <w:p>
+      <w:pPr>
+        <w:spacing w:after="30" w:before="30"/>
+        <w:ind w:left="360"/>
+      </w:pPr>
+      <w:r>
+        <w:rPr>
+          <w:b/>
+        </w:rPr>
+        <w:t xml:space="preserve">Three-branch logic</w:t>
+      </w:r>
+      <w:r>
+        <w:t xml:space="preserve"> — Yes (mrYes): InitializeSetup returns True; wizard continues and overwrites files in-place. No (mrNo): existing uninstaller runs via Exec /SILENT, confirmation shown, InitializeSetup returns False (setup exits, no reinstall). Cancel (mrCancel): InitializeSetup returns False immediately; no changes made. If IsAlreadyInstalled is False the dialog is skipped entirely and InitializeSetup returns True.</w:t>
       </w:r>
     </w:p>
     <w:sectPr>

</xml_diff>